<commit_message>
apply BID check-in feedback: S1 rationale/bridge, S2 quali indicators, S5 templates
</commit_message>
<xml_diff>
--- a/case_study/session_materials/06_CaseStudy_CheatSheet_Session1.docx
+++ b/case_study/session_materials/06_CaseStudy_CheatSheet_Session1.docx
@@ -667,6 +667,79 @@
     <w:p>
       <w:r>
         <w:br w:type="page"/>
+      </w:r>
+    </w:p>
+    <w:p>
+      <w:pPr/>
+      <w:r>
+        <w:rPr/>
+        <w:t xml:space="preserve"/>
+      </w:r>
+    </w:p>
+    <w:p>
+      <w:pPr/>
+      <w:r>
+        <w:rPr>
+          <w:i/>
+        </w:rPr>
+        <w:t xml:space="preserve">In Exercise 3, participants will take these actor-specific behaviors and arrange them into a single causal pathway — connecting program outputs to behavioral changes to child outcomes. The behaviors defined above become the arrows in the causal chain: each one is a testable link. If a behavior does not occur, the chain breaks at that point. This is why specifying behaviors precisely in Exercise 2 is essential before constructing the pathway in Exercise 3.</w:t>
+      </w:r>
+    </w:p>
+    <w:p>
+      <w:pPr/>
+      <w:r>
+        <w:rPr/>
+        <w:t xml:space="preserve"/>
+      </w:r>
+    </w:p>
+    <w:p>
+      <w:pPr/>
+      <w:r>
+        <w:rPr>
+          <w:b/>
+          <w:sz w:val="22"/>
+          <w:color w:val="1F4E79"/>
+        </w:rPr>
+        <w:t xml:space="preserve">BRIDGE TO EXERCISE 3: FROM BEHAVIORS TO CAUSAL CHAIN</w:t>
+      </w:r>
+    </w:p>
+    <w:p>
+      <w:pPr/>
+      <w:r>
+        <w:rPr/>
+        <w:t xml:space="preserve"/>
+      </w:r>
+    </w:p>
+    <w:p>
+      <w:pPr/>
+      <w:r>
+        <w:rPr/>
+        <w:t xml:space="preserve">Organizing behaviors by actor ensures that the Theory of Change specifies whose behavior must change and what each actor must do differently. Without this, ToCs remain vague ("capacity is built") and untestable. Actor-specific behaviors: (1) make the ToC evaluable — each behavior can be measured with a specific indicator; (2) reveal the indirect pathway — the program reaches facilitators and caregivers, but the ultimate target is the child; (3) expose dependencies — facilitator quality affects caregiver capability, which affects child outcomes; (4) enable contribution analysis — if outcomes improve but specific behaviors did not change, the program's contribution claim weakens. In short: behaviors organized by actor turn the ToC from a diagram into a testable causal argument.</w:t>
+      </w:r>
+    </w:p>
+    <w:p>
+      <w:pPr/>
+      <w:r>
+        <w:rPr/>
+        <w:t xml:space="preserve"/>
+      </w:r>
+    </w:p>
+    <w:p>
+      <w:pPr/>
+      <w:r>
+        <w:rPr>
+          <w:b/>
+          <w:sz w:val="22"/>
+          <w:color w:val="1F4E79"/>
+        </w:rPr>
+        <w:t xml:space="preserve">PEDAGOGICAL RATIONALE: WHY ORGANIZE BEHAVIORS BY ACTOR?</w:t>
+      </w:r>
+    </w:p>
+    <w:p>
+      <w:pPr/>
+      <w:r>
+        <w:rPr/>
+        <w:t xml:space="preserve"/>
       </w:r>
     </w:p>
     <w:p>

</xml_diff>